<commit_message>
CI: Actions-Speicher entlasten – Build-Zwischendateien nur 1 Tag und nach dem Release sofort geloescht, taeglicher Aufraeum-Workflow fuer Altbestand, Play-Bundle (.aab) dauerhaft am Release
Releases, Tags, Download-Links (releases/latest/download/...) und die Versionsnummerierung bleiben unveraendert.

Co-Authored-By: Claude Opus 5.5 <noreply@anthropic.com>
Claude-Session: https://claude.ai/code/session_01CaJqjA6T7wr6qkboQBX5Ep
</commit_message>
<xml_diff>
--- a/Android/Play-Store-Anleitung.docx
+++ b/Android/Play-Store-Anleitung.docx
@@ -652,7 +652,7 @@
       <w:r>
         <w:t xml:space="preserve">Am PC öffnen: </w:t>
       </w:r>
-      <w:hyperlink w:history="1" r:id="rIdzrrtvbmgr7t-dctej1iqo">
+      <w:hyperlink w:history="1" r:id="rIdpxphkv24zrhn6s0o9xk7h">
         <w:r>
           <w:rPr>
             <w:rStyle w:val="Hyperlink"/>
@@ -820,7 +820,7 @@
       <w:r>
         <w:t xml:space="preserve">Öffne: </w:t>
       </w:r>
-      <w:hyperlink w:history="1" r:id="rIdnptfktf3x2k8r1d0w06n-">
+      <w:hyperlink w:history="1" r:id="rIdiouunu3xozzss_wahdqjo">
         <w:r>
           <w:rPr>
             <w:rStyle w:val="Hyperlink"/>
@@ -1034,18 +1034,18 @@
       <w:r>
         <w:t xml:space="preserve">Öffne </w:t>
       </w:r>
-      <w:hyperlink w:history="1" r:id="rIdjtzaaf4avxfy0gqbn9fij">
+      <w:hyperlink w:history="1" r:id="rIdk_y6uci3ethfxe2ichu0g">
         <w:r>
           <w:rPr>
             <w:rStyle w:val="Hyperlink"/>
             <w:color w:val="0563C1"/>
             <w:u w:val="single"/>
           </w:rPr>
-          <w:t xml:space="preserve">github.com/Schnielz87/PowerIPTV/actions</w:t>
+          <w:t xml:space="preserve">github.com/Schnielz87/PowerIPTV/releases/latest</w:t>
         </w:r>
       </w:hyperlink>
       <w:r>
-        <w:t xml:space="preserve"> (du musst bei GitHub angemeldet sein).</w:t>
+        <w:t xml:space="preserve">.</w:t>
       </w:r>
     </w:p>
     <w:p>
@@ -1058,43 +1058,7 @@
         <w:spacing w:after="80"/>
       </w:pPr>
       <w:r>
-        <w:t xml:space="preserve">Den obersten Eintrag mit grünem Haken anklicken.</w:t>
-      </w:r>
-    </w:p>
-    <w:p>
-      <w:pPr>
-        <w:pStyle w:val="ListParagraph"/>
-        <w:numPr>
-          <w:ilvl w:val="0"/>
-          <w:numId w:val="6"/>
-        </w:numPr>
-        <w:spacing w:after="80"/>
-      </w:pPr>
-      <w:r>
-        <w:t xml:space="preserve">Ganz unten bei „Artifacts“ auf </w:t>
-      </w:r>
-      <w:r>
-        <w:rPr>
-          <w:b/>
-          <w:bCs/>
-        </w:rPr>
-        <w:t xml:space="preserve">PowerIPTV-Play-Bundle</w:t>
-      </w:r>
-      <w:r>
-        <w:t xml:space="preserve"> klicken – es lädt eine ZIP-Datei herunter.</w:t>
-      </w:r>
-    </w:p>
-    <w:p>
-      <w:pPr>
-        <w:pStyle w:val="ListParagraph"/>
-        <w:numPr>
-          <w:ilvl w:val="0"/>
-          <w:numId w:val="6"/>
-        </w:numPr>
-        <w:spacing w:after="80"/>
-      </w:pPr>
-      <w:r>
-        <w:t xml:space="preserve">ZIP entpacken. Darin liegt </w:t>
+        <w:t xml:space="preserve">Unten bei „Assets“ auf </w:t>
       </w:r>
       <w:r>
         <w:rPr>
@@ -1106,7 +1070,7 @@
         <w:t xml:space="preserve">PowerIPTV-Play-v1.1.XXX.aab</w:t>
       </w:r>
       <w:r>
-        <w:t xml:space="preserve">.</w:t>
+        <w:t xml:space="preserve"> klicken – die Datei wird heruntergeladen.</w:t>
       </w:r>
     </w:p>
     <w:p>
@@ -1126,7 +1090,7 @@
         <w:t xml:space="preserve">Tipp: </w:t>
       </w:r>
       <w:r>
-        <w:t xml:space="preserve">Artefakte hebt GitHub 90 Tage auf. Brauchst du ein frisches, sag mir einfach Bescheid – jede kleine Änderung erzeugt ein neues.</w:t>
+        <w:t xml:space="preserve">Das App-Bundle hängt an jedem Release, genau wie die APK. Es ist nur für Google Play gedacht – auf dem Handy installiert man weiterhin die APK.</w:t>
       </w:r>
     </w:p>
     <w:p>
@@ -1155,7 +1119,7 @@
       <w:r>
         <w:t xml:space="preserve">. Alle Texte stehen zum Kopieren in </w:t>
       </w:r>
-      <w:hyperlink w:history="1" r:id="rIdoxhmbzvocvdopx5mv0rip">
+      <w:hyperlink w:history="1" r:id="rIdvnti2ta_gcidfkqcy7zf1">
         <w:r>
           <w:rPr>
             <w:rStyle w:val="Hyperlink"/>
@@ -2728,7 +2692,7 @@
       <w:r>
         <w:t xml:space="preserve">Öffne </w:t>
       </w:r>
-      <w:hyperlink w:history="1" r:id="rIdppttwihgehbl6k8cxpoow">
+      <w:hyperlink w:history="1" r:id="rId-a4uevtmnfmtshiru6en4">
         <w:r>
           <w:rPr>
             <w:rStyle w:val="Hyperlink"/>
@@ -2976,7 +2940,7 @@
       <w:r>
         <w:t xml:space="preserve">Öffne </w:t>
       </w:r>
-      <w:hyperlink w:history="1" r:id="rIdbzgoyllaexwikandbpvms">
+      <w:hyperlink w:history="1" r:id="rIdtzczc9fyhybsikztard38">
         <w:r>
           <w:rPr>
             <w:rStyle w:val="Hyperlink"/>

</xml_diff>